<commit_message>
Add 13 Oct 2026 meeting report; share letterhead engine
Adds the Word report for the 13 October 2026 prep session between
Abdelrhman Soliman and Yaseen Kurdi, ahead of a prospect meeting:
discovery method for the first founder meeting, the prepared vs.
unprepared founder criteria, engagement paths, commercial framing,
coordination before signing, and client-exclusion signals.

Splits the generator so both reports share one layout: tools/letterhead.py
holds the A4/RTL/Cairo letterhead (header, footer, title band, tables,
headings, bullets) as a Report class, and each report is now a thin
content script. Verified the September report renders unchanged (9 pages)
after the split; the new report is 8 pages.

Co-Authored-By: Claude Opus 5 <noreply@anthropic.com>
Claude-Session: https://claude.ai/code/session_011bkB9nGStfUSpnwim7moE6
</commit_message>
<xml_diff>
--- a/تقرير-اجتماع-13-سبتمبر-2026.docx
+++ b/تقرير-اجتماع-13-سبتمبر-2026.docx
@@ -88,6 +88,13 @@
         </w:tc>
       </w:tr>
     </w:tbl>
+    <w:p>
+      <w:pPr>
+        <w:bidi/>
+        <w:spacing w:before="0" w:after="200" w:line="348" w:lineRule="auto"/>
+        <w:jc w:val="both"/>
+      </w:pPr>
+    </w:p>
     <w:p>
       <w:pPr>
         <w:bidi/>

</xml_diff>